<commit_message>
Docs: track session reference files, fix Paper_3 renames, ignore Phase 4 backup
</commit_message>
<xml_diff>
--- a/Data driven data capture.docx
+++ b/Data driven data capture.docx
@@ -758,33 +758,7 @@
           <w:lang w:eastAsia="en-GB"/>
           <w14:ligatures w14:val="none"/>
         </w:rPr>
-        <w:t xml:space="preserve">: one holding question data, the other holding routing data: </w:t>
-      </w:r>
-      <w:proofErr w:type="gramStart"/>
-      <w:r>
-        <w:rPr>
-          <w:rFonts w:ascii="Arial" w:eastAsia="Times New Roman" w:hAnsi="Arial" w:cs="Arial"/>
-          <w:color w:val="000000"/>
-          <w:kern w:val="0"/>
-          <w:sz w:val="22"/>
-          <w:szCs w:val="22"/>
-          <w:lang w:eastAsia="en-GB"/>
-          <w14:ligatures w14:val="none"/>
-        </w:rPr>
-        <w:t>again</w:t>
-      </w:r>
-      <w:proofErr w:type="gramEnd"/>
-      <w:r>
-        <w:rPr>
-          <w:rFonts w:ascii="Arial" w:eastAsia="Times New Roman" w:hAnsi="Arial" w:cs="Arial"/>
-          <w:color w:val="000000"/>
-          <w:kern w:val="0"/>
-          <w:sz w:val="22"/>
-          <w:szCs w:val="22"/>
-          <w:lang w:eastAsia="en-GB"/>
-          <w14:ligatures w14:val="none"/>
-        </w:rPr>
-        <w:t xml:space="preserve"> more below;</w:t>
+        <w:t>: one holding question data, the other holding routing data: again more below;</w:t>
       </w:r>
     </w:p>
     <w:p>
@@ -1250,7 +1224,6 @@
         </w:rPr>
         <w:t xml:space="preserve">This combination of the service home page making use of the utility, but not being bound by it, has one other important property. If, at any stage, the utility cannot handle a particular combination of questions, the service designer can directly create the relevant pages, just as they do now. </w:t>
       </w:r>
-      <w:proofErr w:type="gramStart"/>
       <w:r>
         <w:rPr>
           <w:rFonts w:ascii="Arial" w:eastAsia="Times New Roman" w:hAnsi="Arial" w:cs="Arial"/>
@@ -1265,58 +1238,7 @@
           <w:lang w:eastAsia="en-GB"/>
           <w14:ligatures w14:val="none"/>
         </w:rPr>
-        <w:t>So</w:t>
-      </w:r>
-      <w:proofErr w:type="gramEnd"/>
-      <w:r>
-        <w:rPr>
-          <w:rFonts w:ascii="Arial" w:eastAsia="Times New Roman" w:hAnsi="Arial" w:cs="Arial"/>
-          <w:b/>
-          <w:bCs/>
-          <w:i/>
-          <w:iCs/>
-          <w:color w:val="000000"/>
-          <w:kern w:val="0"/>
-          <w:sz w:val="22"/>
-          <w:szCs w:val="22"/>
-          <w:lang w:eastAsia="en-GB"/>
-          <w14:ligatures w14:val="none"/>
-        </w:rPr>
-        <w:t xml:space="preserve"> the utility is a genuine helper, it is not a </w:t>
-      </w:r>
-      <w:proofErr w:type="gramStart"/>
-      <w:r>
-        <w:rPr>
-          <w:rFonts w:ascii="Arial" w:eastAsia="Times New Roman" w:hAnsi="Arial" w:cs="Arial"/>
-          <w:b/>
-          <w:bCs/>
-          <w:i/>
-          <w:iCs/>
-          <w:color w:val="000000"/>
-          <w:kern w:val="0"/>
-          <w:sz w:val="22"/>
-          <w:szCs w:val="22"/>
-          <w:lang w:eastAsia="en-GB"/>
-          <w14:ligatures w14:val="none"/>
-        </w:rPr>
-        <w:t>straightjacket</w:t>
-      </w:r>
-      <w:proofErr w:type="gramEnd"/>
-      <w:r>
-        <w:rPr>
-          <w:rFonts w:ascii="Arial" w:eastAsia="Times New Roman" w:hAnsi="Arial" w:cs="Arial"/>
-          <w:b/>
-          <w:bCs/>
-          <w:i/>
-          <w:iCs/>
-          <w:color w:val="000000"/>
-          <w:kern w:val="0"/>
-          <w:sz w:val="22"/>
-          <w:szCs w:val="22"/>
-          <w:lang w:eastAsia="en-GB"/>
-          <w14:ligatures w14:val="none"/>
-        </w:rPr>
-        <w:t>. </w:t>
+        <w:t>So the utility is a genuine helper, it is not a straightjacket. </w:t>
       </w:r>
     </w:p>
     <w:p>
@@ -1798,33 +1720,7 @@
           <w14:ligatures w14:val="none"/>
         </w:rPr>
         <w:lastRenderedPageBreak/>
-        <w:t xml:space="preserve">After many hours looking at IHT and Self Assessment forms, and many more looking at Authorisation process forms, there appear to </w:t>
-      </w:r>
-      <w:proofErr w:type="gramStart"/>
-      <w:r>
-        <w:rPr>
-          <w:rFonts w:ascii="Arial" w:eastAsia="Times New Roman" w:hAnsi="Arial" w:cs="Arial"/>
-          <w:color w:val="000000"/>
-          <w:kern w:val="0"/>
-          <w:sz w:val="22"/>
-          <w:szCs w:val="22"/>
-          <w:lang w:eastAsia="en-GB"/>
-          <w14:ligatures w14:val="none"/>
-        </w:rPr>
-        <w:t>be  three</w:t>
-      </w:r>
-      <w:proofErr w:type="gramEnd"/>
-      <w:r>
-        <w:rPr>
-          <w:rFonts w:ascii="Arial" w:eastAsia="Times New Roman" w:hAnsi="Arial" w:cs="Arial"/>
-          <w:color w:val="000000"/>
-          <w:kern w:val="0"/>
-          <w:sz w:val="22"/>
-          <w:szCs w:val="22"/>
-          <w:lang w:eastAsia="en-GB"/>
-          <w14:ligatures w14:val="none"/>
-        </w:rPr>
-        <w:t xml:space="preserve"> recurring patterns, each of which may appear on the same form.</w:t>
+        <w:t>After many hours looking at IHT and Self Assessment forms, and many more looking at Authorisation process forms, there appear to be  three recurring patterns, each of which may appear on the same form.</w:t>
       </w:r>
     </w:p>
     <w:p>
@@ -1899,33 +1795,7 @@
           <w:lang w:eastAsia="en-GB"/>
           <w14:ligatures w14:val="none"/>
         </w:rPr>
-        <w:t xml:space="preserve"> which admit of a single answer (“Did the deceased leave a will”). Commonly, the questions to be answered depend on the answers provided to earlier questions. For example, only if answering “Yes” to “Did the Deceased leave a will” is the user </w:t>
-      </w:r>
-      <w:proofErr w:type="gramStart"/>
-      <w:r>
-        <w:rPr>
-          <w:rFonts w:ascii="Arial" w:eastAsia="Times New Roman" w:hAnsi="Arial" w:cs="Arial"/>
-          <w:color w:val="000000"/>
-          <w:kern w:val="0"/>
-          <w:sz w:val="22"/>
-          <w:szCs w:val="22"/>
-          <w:lang w:eastAsia="en-GB"/>
-          <w14:ligatures w14:val="none"/>
-        </w:rPr>
-        <w:t>asked</w:t>
-      </w:r>
-      <w:proofErr w:type="gramEnd"/>
-      <w:r>
-        <w:rPr>
-          <w:rFonts w:ascii="Arial" w:eastAsia="Times New Roman" w:hAnsi="Arial" w:cs="Arial"/>
-          <w:color w:val="000000"/>
-          <w:kern w:val="0"/>
-          <w:sz w:val="22"/>
-          <w:szCs w:val="22"/>
-          <w:lang w:eastAsia="en-GB"/>
-          <w14:ligatures w14:val="none"/>
-        </w:rPr>
-        <w:t xml:space="preserve"> “Please attach a copy of the will”. In other words, different users take different conditional routes through the same overall set of questions.</w:t>
+        <w:t xml:space="preserve"> which admit of a single answer (“Did the deceased leave a will”). Commonly, the questions to be answered depend on the answers provided to earlier questions. For example, only if answering “Yes” to “Did the Deceased leave a will” is the user asked “Please attach a copy of the will”. In other words, different users take different conditional routes through the same overall set of questions.</w:t>
       </w:r>
     </w:p>
     <w:p>
@@ -2275,33 +2145,7 @@
           <w:lang w:eastAsia="en-GB"/>
           <w14:ligatures w14:val="none"/>
         </w:rPr>
-        <w:t xml:space="preserve"> all the questions and the </w:t>
-      </w:r>
-      <w:proofErr w:type="gramStart"/>
-      <w:r>
-        <w:rPr>
-          <w:rFonts w:ascii="Arial" w:eastAsia="Times New Roman" w:hAnsi="Arial" w:cs="Arial"/>
-          <w:color w:val="000000"/>
-          <w:kern w:val="0"/>
-          <w:sz w:val="22"/>
-          <w:szCs w:val="22"/>
-          <w:lang w:eastAsia="en-GB"/>
-          <w14:ligatures w14:val="none"/>
-        </w:rPr>
-        <w:t>users</w:t>
-      </w:r>
-      <w:proofErr w:type="gramEnd"/>
-      <w:r>
-        <w:rPr>
-          <w:rFonts w:ascii="Arial" w:eastAsia="Times New Roman" w:hAnsi="Arial" w:cs="Arial"/>
-          <w:color w:val="000000"/>
-          <w:kern w:val="0"/>
-          <w:sz w:val="22"/>
-          <w:szCs w:val="22"/>
-          <w:lang w:eastAsia="en-GB"/>
-          <w14:ligatures w14:val="none"/>
-        </w:rPr>
-        <w:t xml:space="preserve"> answers, allowing the user to amend any answer, before confirming they are content and moving on.  </w:t>
+        <w:t xml:space="preserve"> all the questions and the users answers, allowing the user to amend any answer, before confirming they are content and moving on.  </w:t>
       </w:r>
     </w:p>
     <w:p>
@@ -2348,33 +2192,7 @@
           <w:lang w:eastAsia="en-GB"/>
           <w14:ligatures w14:val="none"/>
         </w:rPr>
-        <w:t xml:space="preserve">There is an important consequence of conditional routes here. If the user chooses to amend their answer to, say, the third question on the confirmation screen, that new answer might alter the conditional route which the user needs to follow. </w:t>
-      </w:r>
-      <w:proofErr w:type="gramStart"/>
-      <w:r>
-        <w:rPr>
-          <w:rFonts w:ascii="Arial" w:eastAsia="Times New Roman" w:hAnsi="Arial" w:cs="Arial"/>
-          <w:color w:val="000000"/>
-          <w:kern w:val="0"/>
-          <w:sz w:val="22"/>
-          <w:szCs w:val="22"/>
-          <w:lang w:eastAsia="en-GB"/>
-          <w14:ligatures w14:val="none"/>
-        </w:rPr>
-        <w:t>So</w:t>
-      </w:r>
-      <w:proofErr w:type="gramEnd"/>
-      <w:r>
-        <w:rPr>
-          <w:rFonts w:ascii="Arial" w:eastAsia="Times New Roman" w:hAnsi="Arial" w:cs="Arial"/>
-          <w:color w:val="000000"/>
-          <w:kern w:val="0"/>
-          <w:sz w:val="22"/>
-          <w:szCs w:val="22"/>
-          <w:lang w:eastAsia="en-GB"/>
-          <w14:ligatures w14:val="none"/>
-        </w:rPr>
-        <w:t xml:space="preserve"> an amendment to the third answer needs to trigger </w:t>
+        <w:t xml:space="preserve">There is an important consequence of conditional routes here. If the user chooses to amend their answer to, say, the third question on the confirmation screen, that new answer might alter the conditional route which the user needs to follow. So an amendment to the third answer needs to trigger </w:t>
       </w:r>
       <w:r>
         <w:rPr>

</xml_diff>